<commit_message>
Test class for Set
generated tests for corresponding Set class and updated Test plan doc with additional test method
</commit_message>
<xml_diff>
--- a/docs/Testing and Verification Plan.docx
+++ b/docs/Testing and Verification Plan.docx
@@ -1,6 +1,6 @@
 
 <file path=word/document.xml><?xml version="1.0" encoding="utf-8"?>
-<w:document xmlns:wpc="http://schemas.microsoft.com/office/word/2010/wordprocessingCanvas" xmlns:cx="http://schemas.microsoft.com/office/drawing/2014/chartex" xmlns:cx1="http://schemas.microsoft.com/office/drawing/2015/9/8/chartex" xmlns:cx2="http://schemas.microsoft.com/office/drawing/2015/10/21/chartex" xmlns:cx3="http://schemas.microsoft.com/office/drawing/2016/5/9/chartex" xmlns:cx4="http://schemas.microsoft.com/office/drawing/2016/5/10/chartex" xmlns:cx5="http://schemas.microsoft.com/office/drawing/2016/5/11/chartex" xmlns:cx6="http://schemas.microsoft.com/office/drawing/2016/5/12/chartex" xmlns:cx7="http://schemas.microsoft.com/office/drawing/2016/5/13/chartex" xmlns:cx8="http://schemas.microsoft.com/office/drawing/2016/5/14/chartex" xmlns:mc="http://schemas.openxmlformats.org/markup-compatibility/2006" xmlns:m="http://schemas.openxmlformats.org/officeDocument/2006/math" xmlns:aink="http://schemas.microsoft.com/office/drawing/2016/ink" xmlns:am3d="http://schemas.microsoft.com/office/drawing/2017/model3d" xmlns:oel="http://schemas.microsoft.com/office/2019/extlst" xmlns:r="http://schemas.openxmlformats.org/officeDocument/2006/relationships" xmlns:wp14="http://schemas.microsoft.com/office/word/2010/wordprocessingDrawing" xmlns:wp="http://schemas.openxmlformats.org/drawingml/2006/wordprocessingDrawing" xmlns:wpg="http://schemas.microsoft.com/office/word/2010/wordprocessingGroup" xmlns:wpi="http://schemas.microsoft.com/office/word/2010/wordprocessingInk" xmlns:wps="http://schemas.microsoft.com/office/word/2010/wordprocessingShape" xmlns:o="urn:schemas-microsoft-com:office:office" xmlns:v="urn:schemas-microsoft-com:vml" xmlns:w10="urn:schemas-microsoft-com:office:word" xmlns:w="http://schemas.openxmlformats.org/wordprocessingml/2006/main" xmlns:w14="http://schemas.microsoft.com/office/word/2010/wordml" xmlns:w15="http://schemas.microsoft.com/office/word/2012/wordml" xmlns:w16cex="http://schemas.microsoft.com/office/word/2018/wordml/cex" xmlns:w16cid="http://schemas.microsoft.com/office/word/2016/wordml/cid" xmlns:w16="http://schemas.microsoft.com/office/word/2018/wordml" xmlns:w16sdtdh="http://schemas.microsoft.com/office/word/2020/wordml/sdtdatahash" xmlns:w16sdtfl="http://schemas.microsoft.com/office/word/2024/wordml/sdtformatlock" xmlns:w16se="http://schemas.microsoft.com/office/word/2015/wordml/symex" xmlns:w16du="http://schemas.microsoft.com/office/word/2023/wordml/word16du" xmlns:wne="http://schemas.microsoft.com/office/word/2006/wordml" mc:Ignorable="w14 w15 w16se w16cid w16 w16cex w16sdtdh w16sdtfl w16du wp14">
+<w:document xmlns:wpc="http://schemas.microsoft.com/office/word/2010/wordprocessingCanvas" xmlns:cx="http://schemas.microsoft.com/office/drawing/2014/chartex" xmlns:cx1="http://schemas.microsoft.com/office/drawing/2015/9/8/chartex" xmlns:cx2="http://schemas.microsoft.com/office/drawing/2015/10/21/chartex" xmlns:cx3="http://schemas.microsoft.com/office/drawing/2016/5/9/chartex" xmlns:cx4="http://schemas.microsoft.com/office/drawing/2016/5/10/chartex" xmlns:cx5="http://schemas.microsoft.com/office/drawing/2016/5/11/chartex" xmlns:cx6="http://schemas.microsoft.com/office/drawing/2016/5/12/chartex" xmlns:cx7="http://schemas.microsoft.com/office/drawing/2016/5/13/chartex" xmlns:cx8="http://schemas.microsoft.com/office/drawing/2016/5/14/chartex" xmlns:mc="http://schemas.openxmlformats.org/markup-compatibility/2006" xmlns:aink="http://schemas.microsoft.com/office/drawing/2016/ink" xmlns:am3d="http://schemas.microsoft.com/office/drawing/2017/model3d" xmlns:o="urn:schemas-microsoft-com:office:office" xmlns:oel="http://schemas.microsoft.com/office/2019/extlst" xmlns:r="http://schemas.openxmlformats.org/officeDocument/2006/relationships" xmlns:m="http://schemas.openxmlformats.org/officeDocument/2006/math" xmlns:v="urn:schemas-microsoft-com:vml" xmlns:wp14="http://schemas.microsoft.com/office/word/2010/wordprocessingDrawing" xmlns:wp="http://schemas.openxmlformats.org/drawingml/2006/wordprocessingDrawing" xmlns:w10="urn:schemas-microsoft-com:office:word" xmlns:w="http://schemas.openxmlformats.org/wordprocessingml/2006/main" xmlns:w14="http://schemas.microsoft.com/office/word/2010/wordml" xmlns:w15="http://schemas.microsoft.com/office/word/2012/wordml" xmlns:w16cex="http://schemas.microsoft.com/office/word/2018/wordml/cex" xmlns:w16cid="http://schemas.microsoft.com/office/word/2016/wordml/cid" xmlns:w16="http://schemas.microsoft.com/office/word/2018/wordml" xmlns:w16du="http://schemas.microsoft.com/office/word/2023/wordml/word16du" xmlns:w16sdtdh="http://schemas.microsoft.com/office/word/2020/wordml/sdtdatahash" xmlns:w16sdtfl="http://schemas.microsoft.com/office/word/2024/wordml/sdtformatlock" xmlns:w16se="http://schemas.microsoft.com/office/word/2015/wordml/symex" xmlns:wpg="http://schemas.microsoft.com/office/word/2010/wordprocessingGroup" xmlns:wpi="http://schemas.microsoft.com/office/word/2010/wordprocessingInk" xmlns:wne="http://schemas.microsoft.com/office/word/2006/wordml" xmlns:wps="http://schemas.microsoft.com/office/word/2010/wordprocessingShape" mc:Ignorable="w14 w15 w16se w16cid w16 w16cex w16sdtdh w16sdtfl w16du wp14">
   <w:body>
     <w:p>
       <w:pPr>
@@ -775,7 +775,6 @@
           <w:u w:val="single"/>
           <w14:ligatures w14:val="none"/>
         </w:rPr>
-        <w:lastRenderedPageBreak/>
         <w:t>SE</w:t>
       </w:r>
       <w:r>
@@ -1681,7 +1680,6 @@
           <w:szCs w:val="22"/>
           <w14:ligatures w14:val="none"/>
         </w:rPr>
-        <w:lastRenderedPageBreak/>
         <w:t>Expected integer listing: {1, 2, 5, 6, 9, 10, 12}</w:t>
       </w:r>
     </w:p>
@@ -2902,6 +2900,172 @@
           </w:p>
         </w:tc>
       </w:tr>
+      <w:tr>
+        <w:tc>
+          <w:tcPr>
+            <w:tcW w:w="0" w:type="auto"/>
+            <w:tcBorders>
+              <w:top w:val="single" w:sz="8" w:space="0" w:color="000000"/>
+              <w:left w:val="single" w:sz="8" w:space="0" w:color="000000"/>
+              <w:bottom w:val="single" w:sz="8" w:space="0" w:color="000000"/>
+              <w:right w:val="single" w:sz="8" w:space="0" w:color="000000"/>
+            </w:tcBorders>
+            <w:tcMar>
+              <w:top w:w="100" w:type="dxa"/>
+              <w:left w:w="100" w:type="dxa"/>
+              <w:bottom w:w="100" w:type="dxa"/>
+              <w:right w:w="100" w:type="dxa"/>
+            </w:tcMar>
+          </w:tcPr>
+          <w:p>
+            <w:pPr>
+              <w:spacing w:after="0" w:line="240" w:lineRule="auto"/>
+              <w:rPr>
+                <w:rFonts w:ascii="Times New Roman" w:eastAsia="Times New Roman" w:hAnsi="Times New Roman" w:cs="Times New Roman"/>
+                <w:color w:val="000000"/>
+                <w:kern w:val="0"/>
+                <w:sz w:val="22"/>
+                <w:szCs w:val="22"/>
+                <w14:ligatures w14:val="none"/>
+              </w:rPr>
+            </w:pPr>
+            <w:r>
+              <w:rPr>
+                <w:rFonts w:ascii="Times New Roman" w:eastAsia="Times New Roman" w:hAnsi="Times New Roman" w:cs="Times New Roman"/>
+                <w:color w:val="000000"/>
+                <w:kern w:val="0"/>
+                <w:sz w:val="22"/>
+                <w:szCs w:val="22"/>
+                <w14:ligatures w14:val="none"/>
+              </w:rPr>
+              <w:t>Set 11</w:t>
+            </w:r>
+          </w:p>
+        </w:tc>
+        <w:tc>
+          <w:tcPr>
+            <w:tcW w:w="0" w:type="auto"/>
+            <w:tcBorders>
+              <w:top w:val="single" w:sz="8" w:space="0" w:color="000000"/>
+              <w:left w:val="single" w:sz="8" w:space="0" w:color="000000"/>
+              <w:bottom w:val="single" w:sz="8" w:space="0" w:color="000000"/>
+              <w:right w:val="single" w:sz="8" w:space="0" w:color="000000"/>
+            </w:tcBorders>
+            <w:tcMar>
+              <w:top w:w="100" w:type="dxa"/>
+              <w:left w:w="100" w:type="dxa"/>
+              <w:bottom w:w="100" w:type="dxa"/>
+              <w:right w:w="100" w:type="dxa"/>
+            </w:tcMar>
+          </w:tcPr>
+          <w:p>
+            <w:pPr>
+              <w:spacing w:after="0" w:line="240" w:lineRule="auto"/>
+              <w:rPr>
+                <w:rFonts w:ascii="Times New Roman" w:eastAsia="Times New Roman" w:hAnsi="Times New Roman" w:cs="Times New Roman"/>
+                <w:color w:val="000000"/>
+                <w:kern w:val="0"/>
+                <w:sz w:val="22"/>
+                <w:szCs w:val="22"/>
+                <w14:ligatures w14:val="none"/>
+              </w:rPr>
+            </w:pPr>
+            <w:r>
+              <w:rPr>
+                <w:rFonts w:ascii="Times New Roman" w:eastAsia="Times New Roman" w:hAnsi="Times New Roman" w:cs="Times New Roman"/>
+                <w:color w:val="000000"/>
+                <w:kern w:val="0"/>
+                <w:sz w:val="22"/>
+                <w:szCs w:val="22"/>
+                <w14:ligatures w14:val="none"/>
+              </w:rPr>
+              <w:t>A = U</w:t>
+            </w:r>
+          </w:p>
+        </w:tc>
+        <w:tc>
+          <w:tcPr>
+            <w:tcW w:w="0" w:type="auto"/>
+            <w:tcBorders>
+              <w:top w:val="single" w:sz="8" w:space="0" w:color="000000"/>
+              <w:left w:val="single" w:sz="8" w:space="0" w:color="000000"/>
+              <w:bottom w:val="single" w:sz="8" w:space="0" w:color="000000"/>
+              <w:right w:val="single" w:sz="8" w:space="0" w:color="000000"/>
+            </w:tcBorders>
+            <w:tcMar>
+              <w:top w:w="100" w:type="dxa"/>
+              <w:left w:w="100" w:type="dxa"/>
+              <w:bottom w:w="100" w:type="dxa"/>
+              <w:right w:w="100" w:type="dxa"/>
+            </w:tcMar>
+          </w:tcPr>
+          <w:p>
+            <w:pPr>
+              <w:spacing w:after="0" w:line="240" w:lineRule="auto"/>
+              <w:rPr>
+                <w:rFonts w:ascii="Times New Roman" w:eastAsia="Times New Roman" w:hAnsi="Times New Roman" w:cs="Times New Roman"/>
+                <w:color w:val="000000"/>
+                <w:kern w:val="0"/>
+                <w:sz w:val="22"/>
+                <w:szCs w:val="22"/>
+                <w14:ligatures w14:val="none"/>
+              </w:rPr>
+            </w:pPr>
+            <w:r>
+              <w:rPr>
+                <w:rFonts w:ascii="Times New Roman" w:eastAsia="Times New Roman" w:hAnsi="Times New Roman" w:cs="Times New Roman"/>
+                <w:color w:val="000000"/>
+                <w:kern w:val="0"/>
+                <w:sz w:val="22"/>
+                <w:szCs w:val="22"/>
+                <w14:ligatures w14:val="none"/>
+              </w:rPr>
+              <w:t>NOT(A)</w:t>
+            </w:r>
+          </w:p>
+        </w:tc>
+        <w:tc>
+          <w:tcPr>
+            <w:tcW w:w="0" w:type="auto"/>
+            <w:tcBorders>
+              <w:top w:val="single" w:sz="8" w:space="0" w:color="000000"/>
+              <w:left w:val="single" w:sz="8" w:space="0" w:color="000000"/>
+              <w:bottom w:val="single" w:sz="8" w:space="0" w:color="000000"/>
+              <w:right w:val="single" w:sz="8" w:space="0" w:color="000000"/>
+            </w:tcBorders>
+            <w:tcMar>
+              <w:top w:w="100" w:type="dxa"/>
+              <w:left w:w="100" w:type="dxa"/>
+              <w:bottom w:w="100" w:type="dxa"/>
+              <w:right w:w="100" w:type="dxa"/>
+            </w:tcMar>
+          </w:tcPr>
+          <w:p>
+            <w:pPr>
+              <w:spacing w:after="0" w:line="240" w:lineRule="auto"/>
+              <w:rPr>
+                <w:rFonts w:ascii="Times New Roman" w:eastAsia="Times New Roman" w:hAnsi="Times New Roman" w:cs="Times New Roman"/>
+                <w:color w:val="000000"/>
+                <w:kern w:val="0"/>
+                <w:sz w:val="22"/>
+                <w:szCs w:val="22"/>
+                <w14:ligatures w14:val="none"/>
+              </w:rPr>
+            </w:pPr>
+            <w:r>
+              <w:rPr>
+                <w:rFonts w:ascii="Times New Roman" w:eastAsia="Times New Roman" w:hAnsi="Times New Roman" w:cs="Times New Roman"/>
+                <w:color w:val="000000"/>
+                <w:kern w:val="0"/>
+                <w:sz w:val="22"/>
+                <w:szCs w:val="22"/>
+                <w14:ligatures w14:val="none"/>
+              </w:rPr>
+              <w:t>0, Bit String 000000000000</w:t>
+            </w:r>
+          </w:p>
+        </w:tc>
+      </w:tr>
     </w:tbl>
     <w:p>
       <w:pPr>
@@ -2923,7 +3087,7 @@
 </file>
 
 <file path=word/styles.xml><?xml version="1.0" encoding="utf-8"?>
-<w:styles xmlns:mc="http://schemas.openxmlformats.org/markup-compatibility/2006" xmlns:r="http://schemas.openxmlformats.org/officeDocument/2006/relationships" xmlns:w="http://schemas.openxmlformats.org/wordprocessingml/2006/main" xmlns:w14="http://schemas.microsoft.com/office/word/2010/wordml" xmlns:w15="http://schemas.microsoft.com/office/word/2012/wordml" xmlns:w16cex="http://schemas.microsoft.com/office/word/2018/wordml/cex" xmlns:w16cid="http://schemas.microsoft.com/office/word/2016/wordml/cid" xmlns:w16="http://schemas.microsoft.com/office/word/2018/wordml" xmlns:w16sdtdh="http://schemas.microsoft.com/office/word/2020/wordml/sdtdatahash" xmlns:w16sdtfl="http://schemas.microsoft.com/office/word/2024/wordml/sdtformatlock" xmlns:w16se="http://schemas.microsoft.com/office/word/2015/wordml/symex" xmlns:w16du="http://schemas.microsoft.com/office/word/2023/wordml/word16du" mc:Ignorable="w14 w15 w16se w16cid w16 w16cex w16sdtdh w16sdtfl w16du">
+<w:styles xmlns:mc="http://schemas.openxmlformats.org/markup-compatibility/2006" xmlns:r="http://schemas.openxmlformats.org/officeDocument/2006/relationships" xmlns:w="http://schemas.openxmlformats.org/wordprocessingml/2006/main" xmlns:w14="http://schemas.microsoft.com/office/word/2010/wordml" xmlns:w15="http://schemas.microsoft.com/office/word/2012/wordml" xmlns:w16cex="http://schemas.microsoft.com/office/word/2018/wordml/cex" xmlns:w16cid="http://schemas.microsoft.com/office/word/2016/wordml/cid" xmlns:w16="http://schemas.microsoft.com/office/word/2018/wordml" xmlns:w16du="http://schemas.microsoft.com/office/word/2023/wordml/word16du" xmlns:w16sdtdh="http://schemas.microsoft.com/office/word/2020/wordml/sdtdatahash" xmlns:w16sdtfl="http://schemas.microsoft.com/office/word/2024/wordml/sdtformatlock" xmlns:w16se="http://schemas.microsoft.com/office/word/2015/wordml/symex" mc:Ignorable="w14 w15 w16se w16cid w16 w16cex w16sdtdh w16sdtfl w16du">
   <w:docDefaults>
     <w:rPrDefault>
       <w:rPr>

</xml_diff>